<commit_message>
clean: borrar todo el analisis previo - reinicio desde cero
</commit_message>
<xml_diff>
--- a/Analisis competitivo modelos Martes/Promt Orginal Impactos.docx
+++ b/Analisis competitivo modelos Martes/Promt Orginal Impactos.docx
@@ -11288,19 +11288,7 @@
         <w:rPr>
           <w:lang w:val="es-CR"/>
         </w:rPr>
-        <w:t xml:space="preserve"> que el delta de costo Competitivo sea </w:t>
-      </w:r>
-      <w:r>
-        <w:rPr>
-          <w:lang w:val="es-CR"/>
-        </w:rPr>
-        <w:t xml:space="preserve">positivo </w:t>
-      </w:r>
-      <w:r>
-        <w:rPr>
-          <w:lang w:val="es-CR"/>
-        </w:rPr>
-        <w:t>que sea móvil según los filtros generales.</w:t>
+        <w:t xml:space="preserve"> que el delta de costo Competitivo sea positivo que sea móvil según los filtros generales.</w:t>
       </w:r>
     </w:p>
     <w:p>
@@ -11916,132 +11904,6 @@
           <w:lang w:val="es-CR"/>
         </w:rPr>
       </w:pPr>
-    </w:p>
-    <w:p>
-      <w:pPr>
-        <w:rPr>
-          <w:lang w:val="es-CR"/>
-        </w:rPr>
-      </w:pPr>
-      <w:r>
-        <w:rPr>
-          <w:lang w:val="es-CR"/>
-        </w:rPr>
-        <w:t xml:space="preserve">Ejemplo de </w:t>
-      </w:r>
-      <w:proofErr w:type="spellStart"/>
-      <w:r>
-        <w:rPr>
-          <w:lang w:val="es-CR"/>
-        </w:rPr>
-        <w:t>como</w:t>
-      </w:r>
-      <w:proofErr w:type="spellEnd"/>
-      <w:r>
-        <w:rPr>
-          <w:lang w:val="es-CR"/>
-        </w:rPr>
-        <w:t xml:space="preserve"> deberían quedar los datos con los cálculos correctos </w:t>
-      </w:r>
-      <w:proofErr w:type="spellStart"/>
-      <w:r>
-        <w:rPr>
-          <w:lang w:val="es-CR"/>
-        </w:rPr>
-        <w:t>usalo</w:t>
-      </w:r>
-      <w:proofErr w:type="spellEnd"/>
-      <w:r>
-        <w:rPr>
-          <w:lang w:val="es-CR"/>
-        </w:rPr>
-        <w:t xml:space="preserve"> para verificar que realmente te </w:t>
-      </w:r>
-      <w:proofErr w:type="spellStart"/>
-      <w:r>
-        <w:rPr>
-          <w:lang w:val="es-CR"/>
-        </w:rPr>
-        <w:t>estan</w:t>
-      </w:r>
-      <w:proofErr w:type="spellEnd"/>
-      <w:r>
-        <w:rPr>
-          <w:lang w:val="es-CR"/>
-        </w:rPr>
-        <w:t xml:space="preserve"> dando </w:t>
-      </w:r>
-      <w:proofErr w:type="spellStart"/>
-      <w:r>
-        <w:rPr>
-          <w:lang w:val="es-CR"/>
-        </w:rPr>
-        <w:t>asi</w:t>
-      </w:r>
-      <w:proofErr w:type="spellEnd"/>
-      <w:r>
-        <w:rPr>
-          <w:lang w:val="es-CR"/>
-        </w:rPr>
-        <w:t xml:space="preserve"> los números:</w:t>
-      </w:r>
-    </w:p>
-    <w:p>
-      <w:pPr>
-        <w:rPr>
-          <w:lang w:val="es-CR"/>
-        </w:rPr>
-      </w:pPr>
-      <w:r>
-        <w:drawing>
-          <wp:inline distT="0" distB="0" distL="0" distR="0" wp14:anchorId="3D3338F8" wp14:editId="362F55BD">
-            <wp:extent cx="6103620" cy="952500"/>
-            <wp:effectExtent l="0" t="0" r="0" b="0"/>
-            <wp:docPr id="377827481" name="Imagen 2"/>
-            <wp:cNvGraphicFramePr>
-              <a:graphicFrameLocks xmlns:a="http://schemas.openxmlformats.org/drawingml/2006/main" noChangeAspect="1"/>
-            </wp:cNvGraphicFramePr>
-            <a:graphic xmlns:a="http://schemas.openxmlformats.org/drawingml/2006/main">
-              <a:graphicData uri="http://schemas.openxmlformats.org/drawingml/2006/picture">
-                <pic:pic xmlns:pic="http://schemas.openxmlformats.org/drawingml/2006/picture">
-                  <pic:nvPicPr>
-                    <pic:cNvPr id="0" name="Picture 2"/>
-                    <pic:cNvPicPr>
-                      <a:picLocks noChangeAspect="1" noChangeArrowheads="1"/>
-                    </pic:cNvPicPr>
-                  </pic:nvPicPr>
-                  <pic:blipFill>
-                    <a:blip r:embed="rId4">
-                      <a:extLst>
-                        <a:ext uri="{28A0092B-C50C-407E-A947-70E740481C1C}">
-                          <a14:useLocalDpi xmlns:a14="http://schemas.microsoft.com/office/drawing/2010/main" val="0"/>
-                        </a:ext>
-                      </a:extLst>
-                    </a:blip>
-                    <a:srcRect/>
-                    <a:stretch>
-                      <a:fillRect/>
-                    </a:stretch>
-                  </pic:blipFill>
-                  <pic:spPr bwMode="auto">
-                    <a:xfrm>
-                      <a:off x="0" y="0"/>
-                      <a:ext cx="6103620" cy="952500"/>
-                    </a:xfrm>
-                    <a:prstGeom prst="rect">
-                      <a:avLst/>
-                    </a:prstGeom>
-                    <a:noFill/>
-                    <a:ln>
-                      <a:noFill/>
-                    </a:ln>
-                  </pic:spPr>
-                </pic:pic>
-              </a:graphicData>
-            </a:graphic>
-          </wp:inline>
-        </w:drawing>
-      </w:r>
     </w:p>
     <w:p>
       <w:pPr>

</xml_diff>